<commit_message>
Added new document explaining assigned networking feature and testing evidence
</commit_message>
<xml_diff>
--- a/docs/Milestone 2 Deliverable.docx
+++ b/docs/Milestone 2 Deliverable.docx
@@ -194,6 +194,16 @@
         </w:rPr>
         <w:t xml:space="preserve">GITHUB LINK: </w:t>
       </w:r>
+      <w:hyperlink r:id="rId5" w:history="1">
+        <w:r>
+          <w:rPr>
+            <w:rStyle w:val="Hyperlink"/>
+            <w:sz w:val="32"/>
+            <w:szCs w:val="32"/>
+          </w:rPr>
+          <w:t>https://github.com/Mdala2004/Ditshupo-Environmental-Engineering-network</w:t>
+        </w:r>
+      </w:hyperlink>
     </w:p>
     <w:p>
       <w:pPr>
@@ -364,7 +374,14 @@
         </w:numPr>
       </w:pPr>
       <w:r>
-        <w:t>ip nat inside applied to the Edge Router's LAN-facing interface (facing the core switch)</w:t>
+        <w:rPr>
+          <w:i/>
+          <w:iCs/>
+        </w:rPr>
+        <w:t>ip nat inside</w:t>
+      </w:r>
+      <w:r>
+        <w:t xml:space="preserve"> applied to the Edge Router's LAN-facing interface (facing the core switch)</w:t>
       </w:r>
     </w:p>
     <w:p>
@@ -375,7 +392,14 @@
         </w:numPr>
       </w:pPr>
       <w:r>
-        <w:t>ip nat outside applied to the Edge Router's WAN-facing interface (facing the ISP)</w:t>
+        <w:rPr>
+          <w:i/>
+          <w:iCs/>
+        </w:rPr>
+        <w:t>ip nat outside</w:t>
+      </w:r>
+      <w:r>
+        <w:t xml:space="preserve"> applied to the Edge Router's WAN-facing interface (facing the ISP)</w:t>
       </w:r>
     </w:p>
     <w:p>
@@ -386,7 +410,14 @@
         </w:numPr>
       </w:pPr>
       <w:r>
-        <w:t>access-list 1 matches the full internal address range (172.30.44.0/23), defining which traffic is eligible for translation</w:t>
+        <w:rPr>
+          <w:i/>
+          <w:iCs/>
+        </w:rPr>
+        <w:t>access-list 1</w:t>
+      </w:r>
+      <w:r>
+        <w:t xml:space="preserve"> matches the full internal address range (172.30.44.0/23), defining which traffic is eligible for translation</w:t>
       </w:r>
     </w:p>
     <w:p>
@@ -397,7 +428,14 @@
         </w:numPr>
       </w:pPr>
       <w:r>
-        <w:t>ip nat inside source list 1 interface &lt;outside-interface&gt; overload performs the translation</w:t>
+        <w:rPr>
+          <w:i/>
+          <w:iCs/>
+        </w:rPr>
+        <w:t xml:space="preserve">ip nat inside source list 1 interface &lt;outside-interface&gt; overload </w:t>
+      </w:r>
+      <w:r>
+        <w:t>performs the translation</w:t>
       </w:r>
     </w:p>
     <w:p>
@@ -475,7 +513,14 @@
     </w:p>
     <w:p>
       <w:r>
-        <w:t>show run | include ip nat on the Edge Router, confirming the inside interface, outside interface, and overload statement are all present.</w:t>
+        <w:rPr>
+          <w:i/>
+          <w:iCs/>
+        </w:rPr>
+        <w:t xml:space="preserve">show run | include ip nat </w:t>
+      </w:r>
+      <w:r>
+        <w:t>on the Edge Router, confirming the inside interface, outside interface, and overload statement are all present.</w:t>
       </w:r>
     </w:p>
     <w:p>
@@ -507,7 +552,7 @@
                     <pic:cNvPicPr/>
                   </pic:nvPicPr>
                   <pic:blipFill>
-                    <a:blip r:embed="rId5"/>
+                    <a:blip r:embed="rId6"/>
                     <a:stretch>
                       <a:fillRect/>
                     </a:stretch>
@@ -569,22 +614,6 @@
     <w:p>
       <w:pPr>
         <w:rPr>
-          <w:i/>
-          <w:iCs/>
-        </w:rPr>
-      </w:pPr>
-    </w:p>
-    <w:p>
-      <w:pPr>
-        <w:rPr>
-          <w:i/>
-          <w:iCs/>
-        </w:rPr>
-      </w:pPr>
-    </w:p>
-    <w:p>
-      <w:pPr>
-        <w:rPr>
           <w:b/>
           <w:bCs/>
         </w:rPr>
@@ -620,12 +649,29 @@
     </w:p>
     <w:p>
       <w:r>
-        <w:t>show ip nat translations on the Edge Router, captured before generating any traffic, showing the table empty or minimal.</w:t>
-      </w:r>
-    </w:p>
-    <w:p>
-      <w:r>
-        <w:t>Ping 198.51.100.10 from an internal PC, then immediately run show ip nat translations on the Edge Router. Shows the PC's private address mapped to the router's public address, with a port number.</w:t>
+        <w:rPr>
+          <w:i/>
+          <w:iCs/>
+        </w:rPr>
+        <w:t xml:space="preserve">show ip nat translations </w:t>
+      </w:r>
+      <w:r>
+        <w:t>on the Edge Router, captured before generating any traffic, showing the table empty.</w:t>
+      </w:r>
+    </w:p>
+    <w:p>
+      <w:r>
+        <w:t xml:space="preserve">Ping 198.51.100.10 from an internal PC, then immediately run </w:t>
+      </w:r>
+      <w:r>
+        <w:rPr>
+          <w:i/>
+          <w:iCs/>
+        </w:rPr>
+        <w:t>show ip nat translations</w:t>
+      </w:r>
+      <w:r>
+        <w:t xml:space="preserve"> on the Edge Router. Shows the PC's private address mapped to the router's public address, with a port number.</w:t>
       </w:r>
     </w:p>
     <w:p>
@@ -651,7 +697,7 @@
                     <pic:cNvPicPr/>
                   </pic:nvPicPr>
                   <pic:blipFill>
-                    <a:blip r:embed="rId6"/>
+                    <a:blip r:embed="rId7"/>
                     <a:stretch>
                       <a:fillRect/>
                     </a:stretch>
@@ -711,7 +757,20 @@
     </w:p>
     <w:p>
       <w:r>
-        <w:t>Ping from PCs in two or three different VLANs, then run show ip nat translations once. Shows multiple private addresses sharing the same public address, differentiated by port — this is the clearest single piece of evidence that PAT is working as designed.</w:t>
+        <w:t xml:space="preserve">Ping from PCs in two or three different VLANs, then run </w:t>
+      </w:r>
+      <w:r>
+        <w:rPr>
+          <w:i/>
+          <w:iCs/>
+        </w:rPr>
+        <w:t>show ip nat translations</w:t>
+      </w:r>
+      <w:r>
+        <w:t xml:space="preserve"> once. Shows multiple private addresses sharing the same public address, differentiated by port</w:t>
+      </w:r>
+      <w:r>
+        <w:t>. Confirmed proof of PAT translation at work.</w:t>
       </w:r>
     </w:p>
     <w:p>
@@ -743,7 +802,7 @@
                     <pic:cNvPicPr/>
                   </pic:nvPicPr>
                   <pic:blipFill>
-                    <a:blip r:embed="rId7"/>
+                    <a:blip r:embed="rId8"/>
                     <a:stretch>
                       <a:fillRect/>
                     </a:stretch>
@@ -802,7 +861,14 @@
     </w:p>
     <w:p>
       <w:r>
-        <w:t>show ip nat statistics on the Edge Router, showing a non-zero hit count.</w:t>
+        <w:rPr>
+          <w:i/>
+          <w:iCs/>
+        </w:rPr>
+        <w:t>show ip nat statistics</w:t>
+      </w:r>
+      <w:r>
+        <w:t xml:space="preserve"> on the Edge Router, showing a non-zero hit count.</w:t>
       </w:r>
     </w:p>
     <w:p>
@@ -834,7 +900,7 @@
                     <pic:cNvPicPr/>
                   </pic:nvPicPr>
                   <pic:blipFill>
-                    <a:blip r:embed="rId8"/>
+                    <a:blip r:embed="rId9"/>
                     <a:stretch>
                       <a:fillRect/>
                     </a:stretch>
@@ -894,7 +960,19 @@
     </w:p>
     <w:p>
       <w:r>
-        <w:t>Ping results from PCs in different VLANs (including Guest) to 198.51.100.10, showing successful replies in each case.</w:t>
+        <w:t>Ping results from PCs in different VLANs (including Guest) to 198.51.100.10</w:t>
+      </w:r>
+      <w:r>
+        <w:t>(internet IP address)</w:t>
+      </w:r>
+      <w:r>
+        <w:t>, show</w:t>
+      </w:r>
+      <w:r>
+        <w:t xml:space="preserve">s </w:t>
+      </w:r>
+      <w:r>
+        <w:t>successful replies in each case.</w:t>
       </w:r>
     </w:p>
     <w:p>
@@ -927,7 +1005,7 @@
                     <pic:cNvPicPr/>
                   </pic:nvPicPr>
                   <pic:blipFill>
-                    <a:blip r:embed="rId9"/>
+                    <a:blip r:embed="rId10"/>
                     <a:stretch>
                       <a:fillRect/>
                     </a:stretch>
@@ -999,7 +1077,7 @@
                     <pic:cNvPicPr/>
                   </pic:nvPicPr>
                   <pic:blipFill>
-                    <a:blip r:embed="rId10"/>
+                    <a:blip r:embed="rId11"/>
                     <a:stretch>
                       <a:fillRect/>
                     </a:stretch>
@@ -1072,7 +1150,7 @@
                     <pic:cNvPicPr/>
                   </pic:nvPicPr>
                   <pic:blipFill>
-                    <a:blip r:embed="rId11"/>
+                    <a:blip r:embed="rId12"/>
                     <a:stretch>
                       <a:fillRect/>
                     </a:stretch>
@@ -1206,7 +1284,19 @@
     </w:p>
     <w:p>
       <w:r>
-        <w:t>Ping from a Guest device to an internal address (fails) and to the internet server (succeeds), demonstrating that NAT provides internet access without compromising the isolation ACL.</w:t>
+        <w:t>Ping from a Guest device to an internal address (fails) and to the internet server (succeeds)</w:t>
+      </w:r>
+      <w:r>
+        <w:t xml:space="preserve">; </w:t>
+      </w:r>
+      <w:r>
+        <w:t>demonstr</w:t>
+      </w:r>
+      <w:r>
+        <w:t>ates</w:t>
+      </w:r>
+      <w:r>
+        <w:t xml:space="preserve"> that NAT provides internet access without compromising the isolation ACL.</w:t>
       </w:r>
     </w:p>
     <w:p>
@@ -1238,7 +1328,7 @@
                     <pic:cNvPicPr/>
                   </pic:nvPicPr>
                   <pic:blipFill>
-                    <a:blip r:embed="rId12"/>
+                    <a:blip r:embed="rId13"/>
                     <a:stretch>
                       <a:fillRect/>
                     </a:stretch>
@@ -2535,6 +2625,41 @@
       <w:spacing w:val="5"/>
     </w:rPr>
   </w:style>
+  <w:style w:type="character" w:styleId="Hyperlink">
+    <w:name w:val="Hyperlink"/>
+    <w:basedOn w:val="DefaultParagraphFont"/>
+    <w:uiPriority w:val="99"/>
+    <w:unhideWhenUsed/>
+    <w:rsid w:val="002E3337"/>
+    <w:rPr>
+      <w:color w:val="467886" w:themeColor="hyperlink"/>
+      <w:u w:val="single"/>
+    </w:rPr>
+  </w:style>
+  <w:style w:type="character" w:styleId="UnresolvedMention">
+    <w:name w:val="Unresolved Mention"/>
+    <w:basedOn w:val="DefaultParagraphFont"/>
+    <w:uiPriority w:val="99"/>
+    <w:semiHidden/>
+    <w:unhideWhenUsed/>
+    <w:rsid w:val="002E3337"/>
+    <w:rPr>
+      <w:color w:val="605E5C"/>
+      <w:shd w:val="clear" w:color="auto" w:fill="E1DFDD"/>
+    </w:rPr>
+  </w:style>
+  <w:style w:type="character" w:styleId="FollowedHyperlink">
+    <w:name w:val="FollowedHyperlink"/>
+    <w:basedOn w:val="DefaultParagraphFont"/>
+    <w:uiPriority w:val="99"/>
+    <w:semiHidden/>
+    <w:unhideWhenUsed/>
+    <w:rsid w:val="00EC16B2"/>
+    <w:rPr>
+      <w:color w:val="96607D" w:themeColor="followedHyperlink"/>
+      <w:u w:val="single"/>
+    </w:rPr>
+  </w:style>
 </w:styles>
 </file>
 

</xml_diff>